<commit_message>
pruning results, report update
10/7/2026 12:17
</commit_message>
<xml_diff>
--- a/z reports/CHY report w5 - data, quan, purn.docx
+++ b/z reports/CHY report w5 - data, quan, purn.docx
@@ -119,8 +119,13 @@
           <w:numId w:val="39"/>
         </w:numPr>
       </w:pPr>
-      <w:r>
-        <w:t xml:space="preserve">eXtreme Weather Object Detection </w:t>
+      <w:proofErr w:type="spellStart"/>
+      <w:r>
+        <w:t>eXtreme</w:t>
+      </w:r>
+      <w:proofErr w:type="spellEnd"/>
+      <w:r>
+        <w:t xml:space="preserve"> Weather Object Detection </w:t>
       </w:r>
       <w:r>
         <w:t>(</w:t>
@@ -201,8 +206,13 @@
           <w:numId w:val="40"/>
         </w:numPr>
       </w:pPr>
-      <w:r>
-        <w:t>Ultralytics' official YOLO dataset guide recommends a baseline split of 70% train / 15% validation / 15% test. It also states that the validation set is used to select the best epoch, adjust hyperparameters, and compare runs, while the test set should only be used once in the final evaluation.</w:t>
+      <w:proofErr w:type="spellStart"/>
+      <w:r>
+        <w:t>Ultralytics</w:t>
+      </w:r>
+      <w:proofErr w:type="spellEnd"/>
+      <w:r>
+        <w:t>' official YOLO dataset guide recommends a baseline split of 70% train / 15% validation / 15% test. It also states that the validation set is used to select the best epoch, adjust hyperparameters, and compare runs, while the test set should only be used once in the final evaluation.</w:t>
       </w:r>
       <w:r>
         <w:t xml:space="preserve"> </w:t>
@@ -240,9 +250,9 @@
         <w:tblLook w:val="04A0" w:firstRow="1" w:lastRow="0" w:firstColumn="1" w:lastColumn="0" w:noHBand="0" w:noVBand="1"/>
       </w:tblPr>
       <w:tblGrid>
-        <w:gridCol w:w="1538"/>
-        <w:gridCol w:w="2208"/>
-        <w:gridCol w:w="6448"/>
+        <w:gridCol w:w="1526"/>
+        <w:gridCol w:w="2152"/>
+        <w:gridCol w:w="6516"/>
       </w:tblGrid>
       <w:tr>
         <w:tc>
@@ -393,8 +403,13 @@
             <w:hideMark/>
           </w:tcPr>
           <w:p>
+            <w:proofErr w:type="gramStart"/>
             <w:r>
-              <w:t>Similar to XWOD 10010 and FishEye8K 8000 traffic images</w:t>
+              <w:t>Similar to</w:t>
+            </w:r>
+            <w:proofErr w:type="gramEnd"/>
+            <w:r>
+              <w:t xml:space="preserve"> XWOD 10010 and FishEye8K 8000 traffic images</w:t>
             </w:r>
             <w:r>
               <w:t xml:space="preserve"> [1] [2]</w:t>
@@ -458,7 +473,15 @@
           </w:tcPr>
           <w:p>
             <w:r>
-              <w:t>Official Ultralytics YOLO recommendation</w:t>
+              <w:t xml:space="preserve">Official </w:t>
+            </w:r>
+            <w:proofErr w:type="spellStart"/>
+            <w:r>
+              <w:t>Ultralytics</w:t>
+            </w:r>
+            <w:proofErr w:type="spellEnd"/>
+            <w:r>
+              <w:t xml:space="preserve"> YOLO recommendation</w:t>
             </w:r>
             <w:r>
               <w:t xml:space="preserve"> [3]</w:t>
@@ -627,7 +650,15 @@
         <w:t>Therefore, t</w:t>
       </w:r>
       <w:r>
-        <w:t xml:space="preserve">his project uses a 70/15/15 train/validation/test split, following the Ultralytics YOLO dataset recommendation. The final </w:t>
+        <w:t xml:space="preserve">his project uses a 70/15/15 train/validation/test split, following the </w:t>
+      </w:r>
+      <w:proofErr w:type="spellStart"/>
+      <w:r>
+        <w:t>Ultralytics</w:t>
+      </w:r>
+      <w:proofErr w:type="spellEnd"/>
+      <w:r>
+        <w:t xml:space="preserve"> YOLO dataset recommendation. The final </w:t>
       </w:r>
       <w:r>
         <w:t xml:space="preserve">11000 </w:t>
@@ -826,7 +857,39 @@
         <w:t>validation</w:t>
       </w:r>
       <w:r>
-        <w:t>/test dataset as similar as possible; for example, avoid concentrating car, bus, truck, and pedestrian classes in a single set.</w:t>
+        <w:t xml:space="preserve">/test dataset as similar as possible; for example, avoid </w:t>
+      </w:r>
+      <w:proofErr w:type="gramStart"/>
+      <w:r>
+        <w:t>concentrating</w:t>
+      </w:r>
+      <w:proofErr w:type="gramEnd"/>
+      <w:r>
+        <w:t xml:space="preserve"> </w:t>
+      </w:r>
+      <w:proofErr w:type="gramStart"/>
+      <w:r>
+        <w:t>car</w:t>
+      </w:r>
+      <w:proofErr w:type="gramEnd"/>
+      <w:r>
+        <w:t xml:space="preserve">, </w:t>
+      </w:r>
+      <w:proofErr w:type="gramStart"/>
+      <w:r>
+        <w:t>bus</w:t>
+      </w:r>
+      <w:proofErr w:type="gramEnd"/>
+      <w:r>
+        <w:t xml:space="preserve">, </w:t>
+      </w:r>
+      <w:proofErr w:type="gramStart"/>
+      <w:r>
+        <w:t>truck</w:t>
+      </w:r>
+      <w:proofErr w:type="gramEnd"/>
+      <w:r>
+        <w:t>, and pedestrian classes in a single set.</w:t>
       </w:r>
     </w:p>
     <w:p>
@@ -882,7 +945,15 @@
         <w:br/>
       </w:r>
       <w:r>
-        <w:t>Do not perform training augmentation on the validation and test sets; otherwise, the final mAP will not be clean.</w:t>
+        <w:t xml:space="preserve">Do not perform training augmentation on the validation and test sets; otherwise, the final </w:t>
+      </w:r>
+      <w:proofErr w:type="spellStart"/>
+      <w:r>
+        <w:t>mAP</w:t>
+      </w:r>
+      <w:proofErr w:type="spellEnd"/>
+      <w:r>
+        <w:t xml:space="preserve"> will not be clean.</w:t>
       </w:r>
     </w:p>
     <w:p>
@@ -912,8 +983,13 @@
     </w:p>
     <w:p/>
     <w:p>
-      <w:r>
-        <w:t>Ultralytics specifically points out that random per-image splitting can cause leakage, especially since video/traffic camera frames are highly correlated; a better approach is to split by scene, camera, day, and location.</w:t>
+      <w:proofErr w:type="spellStart"/>
+      <w:r>
+        <w:t>Ultralytics</w:t>
+      </w:r>
+      <w:proofErr w:type="spellEnd"/>
+      <w:r>
+        <w:t xml:space="preserve"> specifically points out that random per-image splitting can cause leakage, especially since video/traffic camera frames are highly correlated; a better approach is to split by scene, camera, day, and location.</w:t>
       </w:r>
       <w:r>
         <w:t xml:space="preserve"> </w:t>
@@ -1105,7 +1181,15 @@
     <w:p/>
     <w:p>
       <w:r>
-        <w:t xml:space="preserve">The idea is similar to signal processing. When mapping an analog signal to a digital signal, the number of </w:t>
+        <w:t xml:space="preserve">The idea is </w:t>
+      </w:r>
+      <w:proofErr w:type="gramStart"/>
+      <w:r>
+        <w:t>similar to</w:t>
+      </w:r>
+      <w:proofErr w:type="gramEnd"/>
+      <w:r>
+        <w:t xml:space="preserve"> signal processing. When mapping an analog signal to a digital signal, the number of </w:t>
       </w:r>
       <w:r>
         <w:t>var</w:t>
@@ -1129,7 +1213,7 @@
           <w:noProof/>
         </w:rPr>
         <w:drawing>
-          <wp:inline distT="0" distB="0" distL="0" distR="0" wp14:anchorId="24F2CD1A" wp14:editId="035B9CE7">
+          <wp:inline distT="0" distB="0" distL="0" distR="0" wp14:anchorId="24F2CD1A" wp14:editId="6F93BD1B">
             <wp:extent cx="3227441" cy="1828800"/>
             <wp:effectExtent l="0" t="0" r="0" b="0"/>
             <wp:docPr id="407478872" name="Picture 2" descr="b) Quantization of a continuous signal to discrete values - Medical Imaging  Systems - NCBI Bookshelf"/>
@@ -1648,7 +1732,15 @@
     <w:p/>
     <w:p>
       <w:r>
-        <w:t>Aggressive pruning on sensitive layers may reduce mAP, especially for small traffic objects such as distant vehicles or pedestrians. Therefore, pruning should be guided by profiling and layer-based sensitivity analysis.</w:t>
+        <w:t xml:space="preserve">Aggressive pruning on sensitive layers may reduce </w:t>
+      </w:r>
+      <w:proofErr w:type="spellStart"/>
+      <w:r>
+        <w:t>mAP</w:t>
+      </w:r>
+      <w:proofErr w:type="spellEnd"/>
+      <w:r>
+        <w:t>, especially for small traffic objects such as distant vehicles or pedestrians. Therefore, pruning should be guided by profiling and layer-based sensitivity analysis.</w:t>
       </w:r>
     </w:p>
     <w:p/>
@@ -1742,8 +1834,13 @@
       </w:r>
     </w:p>
     <w:p>
-      <w:r>
-        <w:t xml:space="preserve">Pavlitska et al. </w:t>
+      <w:proofErr w:type="spellStart"/>
+      <w:r>
+        <w:t>Pavlitska</w:t>
+      </w:r>
+      <w:proofErr w:type="spellEnd"/>
+      <w:r>
+        <w:t xml:space="preserve"> et al. </w:t>
       </w:r>
       <w:r>
         <w:t>(</w:t>
@@ -1755,7 +1852,15 @@
         <w:t xml:space="preserve">) </w:t>
       </w:r>
       <w:r>
-        <w:t>on YOLOv7 pruning found that selecting filters with the smallest L2-norm achieved better average mAP than L1-norm, random pruning</w:t>
+        <w:t xml:space="preserve">on YOLOv7 pruning found that selecting filters with the smallest L2-norm achieved better average </w:t>
+      </w:r>
+      <w:proofErr w:type="spellStart"/>
+      <w:r>
+        <w:t>mAP</w:t>
+      </w:r>
+      <w:proofErr w:type="spellEnd"/>
+      <w:r>
+        <w:t xml:space="preserve"> than L1-norm, random pruning</w:t>
       </w:r>
       <w:r>
         <w:t xml:space="preserve"> on structured pruning</w:t>
@@ -1938,7 +2043,15 @@
           </w:tcPr>
           <w:p>
             <w:r>
-              <w:t>Accuracy drop from low precision</w:t>
+              <w:t xml:space="preserve">Accuracy </w:t>
+            </w:r>
+            <w:proofErr w:type="gramStart"/>
+            <w:r>
+              <w:t>drop</w:t>
+            </w:r>
+            <w:proofErr w:type="gramEnd"/>
+            <w:r>
+              <w:t xml:space="preserve"> from low precision</w:t>
             </w:r>
           </w:p>
         </w:tc>
@@ -2092,7 +2205,15 @@
     <w:p/>
     <w:p>
       <w:r>
-        <w:t>The PyTorch pruning mask demonstrates the pruning decision, but real deployment speedup may require rebuilding a smaller dense YOLO26n architecture and exporting it again for the target hardware.</w:t>
+        <w:t xml:space="preserve">The </w:t>
+      </w:r>
+      <w:proofErr w:type="spellStart"/>
+      <w:r>
+        <w:t>PyTorch</w:t>
+      </w:r>
+      <w:proofErr w:type="spellEnd"/>
+      <w:r>
+        <w:t xml:space="preserve"> pruning mask demonstrates the pruning decision, but real deployment speedup may require rebuilding a smaller dense YOLO26n architecture and exporting it again for the target hardware.</w:t>
       </w:r>
     </w:p>
     <w:p/>
@@ -2124,7 +2245,15 @@
     <w:p/>
     <w:p>
       <w:r>
-        <w:t>A good optimization result should reduce model size and inference latency while keeping the mAP drop small.</w:t>
+        <w:t xml:space="preserve">A good optimization result should reduce model size and inference latency while keeping the </w:t>
+      </w:r>
+      <w:proofErr w:type="spellStart"/>
+      <w:r>
+        <w:t>mAP</w:t>
+      </w:r>
+      <w:proofErr w:type="spellEnd"/>
+      <w:r>
+        <w:t xml:space="preserve"> drop small.</w:t>
       </w:r>
     </w:p>
     <w:p>
@@ -2169,11 +2298,16 @@
         <w:t>may</w:t>
       </w:r>
       <w:r>
-        <w:t xml:space="preserve"> modif</w:t>
+        <w:t xml:space="preserve"> </w:t>
+      </w:r>
+      <w:proofErr w:type="gramStart"/>
+      <w:r>
+        <w:t>modif</w:t>
       </w:r>
       <w:r>
         <w:t>y</w:t>
       </w:r>
+      <w:proofErr w:type="gramEnd"/>
       <w:r>
         <w:t>); the result will be included in the next week.</w:t>
       </w:r>
@@ -2386,7 +2520,15 @@
         <w:t xml:space="preserve">Later, we </w:t>
       </w:r>
       <w:r>
-        <w:t xml:space="preserve">will convert directly from FP32 to INT8 with TFLite </w:t>
+        <w:t xml:space="preserve">will convert directly from FP32 to INT8 with </w:t>
+      </w:r>
+      <w:proofErr w:type="spellStart"/>
+      <w:r>
+        <w:t>TFLite</w:t>
+      </w:r>
+      <w:proofErr w:type="spellEnd"/>
+      <w:r>
+        <w:t xml:space="preserve"> </w:t>
       </w:r>
       <w:r>
         <w:t>[12]</w:t>
@@ -2414,7 +2556,15 @@
         </w:numPr>
       </w:pPr>
       <w:r>
-        <w:t>Finally, summarize in a table: Method / Model size / mAP50-95 / Latency / FPS / Accuracy drop.</w:t>
+        <w:t xml:space="preserve">Finally, summarize in a table: Method / Model size / mAP50-95 / Latency / FPS / Accuracy </w:t>
+      </w:r>
+      <w:proofErr w:type="gramStart"/>
+      <w:r>
+        <w:t>drop</w:t>
+      </w:r>
+      <w:proofErr w:type="gramEnd"/>
+      <w:r>
+        <w:t>.</w:t>
       </w:r>
     </w:p>
     <w:p>
@@ -2434,7 +2584,7 @@
     <w:p/>
     <w:p>
       <w:pPr>
-        <w:ind w:left="480" w:hangingChars="200" w:hanging="480"/>
+        <w:ind w:left="440" w:hangingChars="200" w:hanging="440"/>
       </w:pPr>
       <w:r>
         <w:t xml:space="preserve">[1] Chen et al., XWOD: A Real-World Benchmark for Object Detection under Extreme Weather Conditions, 2026. </w:t>
@@ -2450,15 +2600,23 @@
     </w:p>
     <w:p>
       <w:pPr>
-        <w:ind w:left="480" w:hangingChars="200" w:hanging="480"/>
-      </w:pPr>
-    </w:p>
-    <w:p>
-      <w:pPr>
-        <w:ind w:left="480" w:hangingChars="200" w:hanging="480"/>
-      </w:pPr>
-      <w:r>
-        <w:t xml:space="preserve">[2] Gochoo et al., FishEye8K: A Benchmark and Dataset for Fisheye Camera Object Detection, 2023. </w:t>
+        <w:ind w:left="440" w:hangingChars="200" w:hanging="440"/>
+      </w:pPr>
+    </w:p>
+    <w:p>
+      <w:pPr>
+        <w:ind w:left="440" w:hangingChars="200" w:hanging="440"/>
+      </w:pPr>
+      <w:r>
+        <w:t xml:space="preserve">[2] </w:t>
+      </w:r>
+      <w:proofErr w:type="spellStart"/>
+      <w:r>
+        <w:t>Gochoo</w:t>
+      </w:r>
+      <w:proofErr w:type="spellEnd"/>
+      <w:r>
+        <w:t xml:space="preserve"> et al., FishEye8K: A Benchmark and Dataset for Fisheye Camera Object Detection, 2023. </w:t>
       </w:r>
       <w:hyperlink r:id="rId15" w:history="1">
         <w:r>
@@ -2471,15 +2629,23 @@
     </w:p>
     <w:p>
       <w:pPr>
-        <w:ind w:left="480" w:hangingChars="200" w:hanging="480"/>
-      </w:pPr>
-    </w:p>
-    <w:p>
-      <w:pPr>
-        <w:ind w:left="480" w:hangingChars="200" w:hanging="480"/>
-      </w:pPr>
-      <w:r>
-        <w:t xml:space="preserve">[3] Ultralytics, Split the Dataset Correctly, n.d. </w:t>
+        <w:ind w:left="440" w:hangingChars="200" w:hanging="440"/>
+      </w:pPr>
+    </w:p>
+    <w:p>
+      <w:pPr>
+        <w:ind w:left="440" w:hangingChars="200" w:hanging="440"/>
+      </w:pPr>
+      <w:r>
+        <w:t xml:space="preserve">[3] </w:t>
+      </w:r>
+      <w:proofErr w:type="spellStart"/>
+      <w:r>
+        <w:t>Ultralytics</w:t>
+      </w:r>
+      <w:proofErr w:type="spellEnd"/>
+      <w:r>
+        <w:t xml:space="preserve">, Split the Dataset Correctly, n.d. </w:t>
       </w:r>
       <w:hyperlink r:id="rId16" w:history="1">
         <w:r>
@@ -2492,15 +2658,23 @@
     </w:p>
     <w:p>
       <w:pPr>
-        <w:ind w:left="480" w:hangingChars="200" w:hanging="480"/>
-      </w:pPr>
-    </w:p>
-    <w:p>
-      <w:pPr>
-        <w:ind w:left="480" w:hangingChars="200" w:hanging="480"/>
-      </w:pPr>
-      <w:r>
-        <w:t xml:space="preserve">[4] Ultralytics, Know When the Dataset Is Ready, n.d. </w:t>
+        <w:ind w:left="440" w:hangingChars="200" w:hanging="440"/>
+      </w:pPr>
+    </w:p>
+    <w:p>
+      <w:pPr>
+        <w:ind w:left="440" w:hangingChars="200" w:hanging="440"/>
+      </w:pPr>
+      <w:r>
+        <w:t xml:space="preserve">[4] </w:t>
+      </w:r>
+      <w:proofErr w:type="spellStart"/>
+      <w:r>
+        <w:t>Ultralytics</w:t>
+      </w:r>
+      <w:proofErr w:type="spellEnd"/>
+      <w:r>
+        <w:t xml:space="preserve">, Know When the Dataset Is Ready, n.d. </w:t>
       </w:r>
       <w:hyperlink r:id="rId17" w:history="1">
         <w:r>
@@ -2513,12 +2687,12 @@
     </w:p>
     <w:p>
       <w:pPr>
-        <w:ind w:left="480" w:hangingChars="200" w:hanging="480"/>
-      </w:pPr>
-    </w:p>
-    <w:p>
-      <w:pPr>
-        <w:ind w:left="480" w:hangingChars="200" w:hanging="480"/>
+        <w:ind w:left="440" w:hangingChars="200" w:hanging="440"/>
+      </w:pPr>
+    </w:p>
+    <w:p>
+      <w:pPr>
+        <w:ind w:left="440" w:hangingChars="200" w:hanging="440"/>
       </w:pPr>
       <w:r>
         <w:t xml:space="preserve">[5] MIOvision, MIO-TCD: Localization Challenge Dataset, n.d. </w:t>
@@ -2534,15 +2708,23 @@
     </w:p>
     <w:p>
       <w:pPr>
-        <w:ind w:left="480" w:hangingChars="200" w:hanging="480"/>
-      </w:pPr>
-    </w:p>
-    <w:p>
-      <w:pPr>
-        <w:ind w:left="480" w:hangingChars="200" w:hanging="480"/>
-      </w:pPr>
-      <w:r>
-        <w:t xml:space="preserve">[6] Ultralytics, Split the Dataset Correctly, n.d. </w:t>
+        <w:ind w:left="440" w:hangingChars="200" w:hanging="440"/>
+      </w:pPr>
+    </w:p>
+    <w:p>
+      <w:pPr>
+        <w:ind w:left="440" w:hangingChars="200" w:hanging="440"/>
+      </w:pPr>
+      <w:r>
+        <w:t xml:space="preserve">[6] </w:t>
+      </w:r>
+      <w:proofErr w:type="spellStart"/>
+      <w:r>
+        <w:t>Ultralytics</w:t>
+      </w:r>
+      <w:proofErr w:type="spellEnd"/>
+      <w:r>
+        <w:t xml:space="preserve">, Split the Dataset Correctly, n.d. </w:t>
       </w:r>
       <w:hyperlink r:id="rId19" w:history="1">
         <w:r>
@@ -2555,12 +2737,12 @@
     </w:p>
     <w:p>
       <w:pPr>
-        <w:ind w:left="480" w:hangingChars="200" w:hanging="480"/>
-      </w:pPr>
-    </w:p>
-    <w:p>
-      <w:pPr>
-        <w:ind w:left="480" w:hangingChars="200" w:hanging="480"/>
+        <w:ind w:left="440" w:hangingChars="200" w:hanging="440"/>
+      </w:pPr>
+    </w:p>
+    <w:p>
+      <w:pPr>
+        <w:ind w:left="440" w:hangingChars="200" w:hanging="440"/>
       </w:pPr>
       <w:r>
         <w:t xml:space="preserve">[7] Jacob et al., Quantization and Training of Neural Networks for Efficient Integer-Arithmetic-Only Inference, 2017. </w:t>
@@ -2576,15 +2758,23 @@
     </w:p>
     <w:p>
       <w:pPr>
-        <w:ind w:left="480" w:hangingChars="200" w:hanging="480"/>
-      </w:pPr>
-    </w:p>
-    <w:p>
-      <w:pPr>
-        <w:ind w:left="480" w:hangingChars="200" w:hanging="480"/>
-      </w:pPr>
-      <w:r>
-        <w:t xml:space="preserve">[8] Subramanian et al., Practical Quantization in PyTorch, 2022. </w:t>
+        <w:ind w:left="440" w:hangingChars="200" w:hanging="440"/>
+      </w:pPr>
+    </w:p>
+    <w:p>
+      <w:pPr>
+        <w:ind w:left="440" w:hangingChars="200" w:hanging="440"/>
+      </w:pPr>
+      <w:r>
+        <w:t xml:space="preserve">[8] Subramanian et al., Practical Quantization in </w:t>
+      </w:r>
+      <w:proofErr w:type="spellStart"/>
+      <w:r>
+        <w:t>PyTorch</w:t>
+      </w:r>
+      <w:proofErr w:type="spellEnd"/>
+      <w:r>
+        <w:t xml:space="preserve">, 2022. </w:t>
       </w:r>
       <w:hyperlink r:id="rId21" w:history="1">
         <w:r>
@@ -2597,12 +2787,12 @@
     </w:p>
     <w:p>
       <w:pPr>
-        <w:ind w:left="480" w:hangingChars="200" w:hanging="480"/>
-      </w:pPr>
-    </w:p>
-    <w:p>
-      <w:pPr>
-        <w:ind w:left="480" w:hangingChars="200" w:hanging="480"/>
+        <w:ind w:left="440" w:hangingChars="200" w:hanging="440"/>
+      </w:pPr>
+    </w:p>
+    <w:p>
+      <w:pPr>
+        <w:ind w:left="440" w:hangingChars="200" w:hanging="440"/>
       </w:pPr>
       <w:r>
         <w:t xml:space="preserve">[9] Han et al., Deep Compression: Compressing Deep Neural Networks with Pruning, Trained Quantization and Huffman Coding, 2015. </w:t>
@@ -2618,12 +2808,12 @@
     </w:p>
     <w:p>
       <w:pPr>
-        <w:ind w:left="480" w:hangingChars="200" w:hanging="480"/>
-      </w:pPr>
-    </w:p>
-    <w:p>
-      <w:pPr>
-        <w:ind w:left="480" w:hangingChars="200" w:hanging="480"/>
+        <w:ind w:left="440" w:hangingChars="200" w:hanging="440"/>
+      </w:pPr>
+    </w:p>
+    <w:p>
+      <w:pPr>
+        <w:ind w:left="440" w:hangingChars="200" w:hanging="440"/>
       </w:pPr>
       <w:r>
         <w:t xml:space="preserve">[10] Cai et al., Structured Pruning is All You Need for Pruning CNNs at Initialization, 2022. </w:t>
@@ -2639,15 +2829,23 @@
     </w:p>
     <w:p>
       <w:pPr>
-        <w:ind w:left="480" w:hangingChars="200" w:hanging="480"/>
-      </w:pPr>
-    </w:p>
-    <w:p>
-      <w:pPr>
-        <w:ind w:left="480" w:hangingChars="200" w:hanging="480"/>
-      </w:pPr>
-      <w:r>
-        <w:t xml:space="preserve">[11] Pavlitska et al., Iterative Filter Pruning for Concatenation-based CNN Architectures, 2024. </w:t>
+        <w:ind w:left="440" w:hangingChars="200" w:hanging="440"/>
+      </w:pPr>
+    </w:p>
+    <w:p>
+      <w:pPr>
+        <w:ind w:left="440" w:hangingChars="200" w:hanging="440"/>
+      </w:pPr>
+      <w:r>
+        <w:t xml:space="preserve">[11] </w:t>
+      </w:r>
+      <w:proofErr w:type="spellStart"/>
+      <w:r>
+        <w:t>Pavlitska</w:t>
+      </w:r>
+      <w:proofErr w:type="spellEnd"/>
+      <w:r>
+        <w:t xml:space="preserve"> et al., Iterative Filter Pruning for Concatenation-based CNN Architectures, 2024. </w:t>
       </w:r>
       <w:hyperlink r:id="rId24" w:history="1">
         <w:r>
@@ -2660,12 +2858,12 @@
     </w:p>
     <w:p>
       <w:pPr>
-        <w:ind w:left="480" w:hangingChars="200" w:hanging="480"/>
-      </w:pPr>
-    </w:p>
-    <w:p>
-      <w:pPr>
-        <w:ind w:left="480" w:hangingChars="200" w:hanging="480"/>
+        <w:ind w:left="440" w:hangingChars="200" w:hanging="440"/>
+      </w:pPr>
+    </w:p>
+    <w:p>
+      <w:pPr>
+        <w:ind w:left="440" w:hangingChars="200" w:hanging="440"/>
       </w:pPr>
       <w:r>
         <w:t xml:space="preserve">[12] TensorFlow, Post-training Quantization, 2022. </w:t>
@@ -2681,12 +2879,12 @@
     </w:p>
     <w:p>
       <w:pPr>
-        <w:ind w:left="480" w:hangingChars="200" w:hanging="480"/>
-      </w:pPr>
-    </w:p>
-    <w:p>
-      <w:pPr>
-        <w:ind w:left="480" w:hangingChars="200" w:hanging="480"/>
+        <w:ind w:left="440" w:hangingChars="200" w:hanging="440"/>
+      </w:pPr>
+    </w:p>
+    <w:p>
+      <w:pPr>
+        <w:ind w:left="440" w:hangingChars="200" w:hanging="440"/>
       </w:pPr>
       <w:r>
         <w:t xml:space="preserve">[13] Tian et al., Traffic Flow Information Detection under Resource Limitations Based on Framework Optimization, 2026. </w:t>
@@ -2702,7 +2900,7 @@
     </w:p>
     <w:p>
       <w:pPr>
-        <w:ind w:left="480" w:hangingChars="200" w:hanging="480"/>
+        <w:ind w:left="440" w:hangingChars="200" w:hanging="440"/>
       </w:pPr>
     </w:p>
     <w:sectPr>
@@ -7766,12 +7964,13 @@
   <w:style w:type="paragraph" w:default="1" w:styleId="Normal">
     <w:name w:val="Normal"/>
     <w:qFormat/>
-    <w:rsid w:val="00CD41BA"/>
+    <w:rsid w:val="00BB1FDD"/>
     <w:pPr>
       <w:snapToGrid w:val="0"/>
     </w:pPr>
     <w:rPr>
       <w:rFonts w:ascii="Times New Roman" w:eastAsia="Times New Roman" w:hAnsi="Times New Roman"/>
+      <w:sz w:val="22"/>
     </w:rPr>
   </w:style>
   <w:style w:type="paragraph" w:styleId="Heading1">

</xml_diff>